<commit_message>
Deploy preview for PR 93 🛫
</commit_message>
<xml_diff>
--- a/pr-preview/pr-93/demo-include-in-header.docx
+++ b/pr-preview/pr-93/demo-include-in-header.docx
@@ -875,7 +875,7 @@
         <w:t xml:space="preserve"> </w:t>
       </w:r>
       <w:r>
-        <w:t xml:space="preserve">— all macros work, including</w:t>
+        <w:t xml:space="preserve">— macros work, including</w:t>
       </w:r>
       <w:r>
         <w:t xml:space="preserve"> </w:t>
@@ -887,7 +887,97 @@
         <w:t xml:space="preserve">\providecommand</w:t>
       </w:r>
       <w:r>
-        <w:t xml:space="preserve">.</w:t>
+        <w:t xml:space="preserve"> </w:t>
+      </w:r>
+      <w:r>
+        <w:t xml:space="preserve">(note that LaTeX’s font-encoding packages re-assert</w:t>
+      </w:r>
+      <w:r>
+        <w:t xml:space="preserve"> </w:t>
+      </w:r>
+      <w:r>
+        <w:rPr>
+          <w:rStyle w:val="VerbatimChar"/>
+        </w:rPr>
+        <w:t xml:space="preserve">\v</w:t>
+      </w:r>
+      <w:r>
+        <w:t xml:space="preserve"> </w:t>
+      </w:r>
+      <w:r>
+        <w:t xml:space="preserve">as a text caron accent at</w:t>
+      </w:r>
+      <w:r>
+        <w:t xml:space="preserve"> </w:t>
+      </w:r>
+      <w:r>
+        <w:rPr>
+          <w:rStyle w:val="VerbatimChar"/>
+        </w:rPr>
+        <w:t xml:space="preserve">\begin{document}</w:t>
+      </w:r>
+      <w:r>
+        <w:t xml:space="preserve">, so</w:t>
+      </w:r>
+      <w:r>
+        <w:t xml:space="preserve"> </w:t>
+      </w:r>
+      <w:r>
+        <w:rPr>
+          <w:rStyle w:val="VerbatimChar"/>
+        </w:rPr>
+        <w:t xml:space="preserve">\v{x}</w:t>
+      </w:r>
+      <w:r>
+        <w:t xml:space="preserve"> </w:t>
+      </w:r>
+      <w:r>
+        <w:t xml:space="preserve">produces no vector notation under</w:t>
+      </w:r>
+      <w:r>
+        <w:t xml:space="preserve"> </w:t>
+      </w:r>
+      <w:r>
+        <w:rPr>
+          <w:rStyle w:val="VerbatimChar"/>
+        </w:rPr>
+        <w:t xml:space="preserve">include-in-header</w:t>
+      </w:r>
+      <w:r>
+        <w:t xml:space="preserve"> </w:t>
+      </w:r>
+      <w:r>
+        <w:t xml:space="preserve">unless re-asserted in the preamble; use</w:t>
+      </w:r>
+      <w:r>
+        <w:t xml:space="preserve"> </w:t>
+      </w:r>
+      <w:r>
+        <w:rPr>
+          <w:rStyle w:val="VerbatimChar"/>
+        </w:rPr>
+        <w:t xml:space="preserve">\vec{x}</w:t>
+      </w:r>
+      <w:r>
+        <w:t xml:space="preserve"> </w:t>
+      </w:r>
+      <w:r>
+        <w:t xml:space="preserve">or</w:t>
+      </w:r>
+      <w:r>
+        <w:t xml:space="preserve"> </w:t>
+      </w:r>
+      <w:r>
+        <w:rPr>
+          <w:rStyle w:val="VerbatimChar"/>
+        </w:rPr>
+        <w:t xml:space="preserve">\vecf{x}</w:t>
+      </w:r>
+      <w:r>
+        <w:t xml:space="preserve"> </w:t>
+      </w:r>
+      <w:r>
+        <w:t xml:space="preserve">for robust cross-format vector notation).</w:t>
       </w:r>
     </w:p>
     <w:p>

</xml_diff>